<commit_message>
Remove AI/Genspark features from sheets web, fix xlsx save bugs, replace Chinese fixtures with English, add ROADMAP.md, remove all ONLYOFFICE references
Sheets web port:
- Remove AI panel and ribbon buttons from web build (gated on __prismofficeWeb)
- Fix sheetOrder check that broke rename/add sheet operations
- Fix type errors in sheets-xlsx.ts for noUncheckedIndexedAccess
- Add __prismofficeWeb flag to sheets web entry and env.d.ts

Fixtures:
- Replace Chinese characters in docx fixtures with English equivalents
- Copy updated fixtures to apps/reference-host and fixtures/generated

Reference host:
- Add xlsx file upload routing
- Add .xlsx/.xls accept to file input

Documentation:
- Add ROADMAP.md with project phases and initiatives
- Remove all ONLYOFFICE mentions from codebase

Bundle:
- Rebuild sheets web bundle (new hash: BHZWT9xo)
</commit_message>
<xml_diff>
--- a/apps/reference-host/fixtures/kitchen-sink.docx
+++ b/apps/reference-host/fixtures/kitchen-sink.docx
@@ -7,46 +7,46 @@
         <w:pStyle w:val="Heading1"/>
       </w:pPr>
       <w:r>
-        <w:t>第一章 概述</w:t>
-      </w:r>
-    </w:p>
-    <w:p>
-      <w:r>
-        <w:t xml:space="preserve">普通段落,包含</w:t>
+        <w:t>Chapter 1 Overview</w:t>
+      </w:r>
+    </w:p>
+    <w:p>
+      <w:r>
+        <w:t xml:space="preserve">Normal paragraph, contains</w:t>
       </w:r>
       <w:r>
         <w:rPr>
           <w:b/>
         </w:rPr>
-        <w:t>加粗</w:t>
+        <w:t>bold</w:t>
       </w:r>
       <w:r>
         <w:rPr>
           <w:i/>
         </w:rPr>
-        <w:t>斜体</w:t>
+        <w:t>italic</w:t>
       </w:r>
       <w:r>
         <w:rPr>
           <w:u w:val="single"/>
         </w:rPr>
-        <w:t>下划线</w:t>
+        <w:t>underline</w:t>
       </w:r>
       <w:r>
         <w:rPr>
           <w:strike/>
         </w:rPr>
-        <w:t>删除线</w:t>
+        <w:t>strikethrough</w:t>
       </w:r>
       <w:r>
         <w:rPr>
           <w:color w:val="FF0000"/>
           <w:sz w:val="28"/>
         </w:rPr>
-        <w:t>红色14号</w:t>
-      </w:r>
-      <w:r>
-        <w:t xml:space="preserve">与特殊字符 &amp; &lt; &gt; 结束。</w:t>
+        <w:t>red 14pt</w:t>
+      </w:r>
+      <w:r>
+        <w:t xml:space="preserve">with special chars &amp; &lt; &gt; at end.</w:t>
       </w:r>
     </w:p>
     <w:p>
@@ -54,7 +54,7 @@
         <w:pStyle w:val="Heading2"/>
       </w:pPr>
       <w:r>
-        <w:t>1.1 列表</w:t>
+        <w:t>1.1 Lists</w:t>
       </w:r>
     </w:p>
     <w:p>
@@ -66,7 +66,7 @@
         </w:numPr>
       </w:pPr>
       <w:r>
-        <w:t>无序项一</w:t>
+        <w:t>Unordered item 1</w:t>
       </w:r>
     </w:p>
     <w:p>
@@ -78,7 +78,7 @@
         </w:numPr>
       </w:pPr>
       <w:r>
-        <w:t>无序项二</w:t>
+        <w:t>Unordered item 2</w:t>
       </w:r>
     </w:p>
     <w:p>
@@ -90,19 +90,19 @@
         </w:numPr>
       </w:pPr>
       <w:r>
-        <w:t>有序项一</w:t>
-      </w:r>
-    </w:p>
-    <w:p>
-      <w:r>
-        <w:t xml:space="preserve">链接示例:</w:t>
+        <w:t>Ordered item 1</w:t>
+      </w:r>
+    </w:p>
+    <w:p>
+      <w:r>
+        <w:t xml:space="preserve">Link example:</w:t>
       </w:r>
       <w:hyperlink r:id="rId20">
         <w:r>
           <w:rPr>
             <w:rStyle w:val="Hyperlink"/>
           </w:rPr>
-          <w:t>示例网站</w:t>
+          <w:t>Example site</w:t>
         </w:r>
       </w:hyperlink>
     </w:p>
@@ -170,7 +170,7 @@
     </w:p>
     <w:p>
       <w:r>
-        <w:t>尾段。</w:t>
+        <w:t>Final paragraph.</w:t>
       </w:r>
     </w:p>
     <w:sectPr>

</xml_diff>